<commit_message>
feat: complete i18n implementation - build verified
</commit_message>
<xml_diff>
--- a/docs/copywriting/about.docx
+++ b/docs/copywriting/about.docx
@@ -151,7 +151,7 @@
         <w:t xml:space="preserve"> </w:t>
       </w:r>
       <w:r>
-        <w:t xml:space="preserve">The Bahá’í Faith is a world religion whose purpose is to unite all peoples in one universal cause and one common faith.</w:t>
+        <w:t xml:space="preserve">The fundamental purpose animating the Bahá’í Faith is to safeguard the interests and promote the unity of the human race, and to foster the spirit of love and fellowship amongst all people.</w:t>
       </w:r>
     </w:p>
     <w:p>
@@ -159,7 +159,7 @@
         <w:pStyle w:val="BodyText"/>
       </w:pPr>
       <w:r>
-        <w:t xml:space="preserve">Founded by Bahá’u’lláh in the nineteenth century, the Bahá’í Faith has spread to virtually every country and territory on Earth, embracing people from more than 2,100 ethnic, racial, and tribal backgrounds. At the heart of the Faith is the conviction that humanity is one single race, and that the day has come for humanity’s unification into one global society.</w:t>
+        <w:t xml:space="preserve">Founded by Bahá’u’lláh in the nineteenth century, the Bahá’í Faith has spread to virtually every country and territory on Earth, embracing people from more than 2,100 ethnic, racial, and tribal backgrounds. At the heart of the Faith is the conviction that humanity is one family, and that the day has come for humanity’s unification into one global society.</w:t>
       </w:r>
     </w:p>
     <w:p>
@@ -167,7 +167,7 @@
         <w:pStyle w:val="BodyText"/>
       </w:pPr>
       <w:r>
-        <w:t xml:space="preserve">Bahá’ís are engaged in a global endeavour to build vibrant communities that reflect the principles of justice, unity, and service. Through grassroots activities such as devotional gatherings, study circles, and programs for children and youth, Bahá’ís and their friends work together to translate spiritual principles into social action.</w:t>
+        <w:t xml:space="preserve">Bahá’ís are engaged in a twofold endeavour: attending to the inner life of the individual and contributing to the transformation of society. These are not separate aims. Through devotional meetings, study circles, and programs for children and youth, Bahá’ís and their friends work to build communities that reflect the principles of justice, unity, and the oneness of humankind.</w:t>
       </w:r>
     </w:p>
     <w:p>
@@ -303,7 +303,7 @@
         <w:t xml:space="preserve"> </w:t>
       </w:r>
       <w:r>
-        <w:t xml:space="preserve">The oneness of humanity is the central teaching of the Bahá’í Faith.</w:t>
+        <w:t xml:space="preserve">The oneness of humanity — the pivot round which all else revolves.</w:t>
       </w:r>
     </w:p>
     <w:p>
@@ -321,7 +321,7 @@
         <w:t xml:space="preserve"> </w:t>
       </w:r>
       <w:r>
-        <w:t xml:space="preserve">Bahá’ís believe that humanity is one family, that women and men are equal, and that the diversity of the human race is a source of strength.</w:t>
+        <w:t xml:space="preserve">Bahá’ís believe that humanity is one family. All else flows from this conviction: the equality of women and men, the elimination of prejudice, the harmony of science and religion.</w:t>
       </w:r>
     </w:p>
     <w:bookmarkStart w:id="22" w:name="unity-of-humanity"/>
@@ -338,7 +338,7 @@
         <w:pStyle w:val="FirstParagraph"/>
       </w:pPr>
       <w:r>
-        <w:t xml:space="preserve">The principle that all people belong to one human family—bound together regardless of race, nation, or creed—is the cornerstone of the Bahá’í Faith.</w:t>
+        <w:t xml:space="preserve">All people belong to one human family. This is not merely an ideal but the foundation upon which a just and peaceful civilisation can be built.</w:t>
       </w:r>
     </w:p>
     <w:bookmarkEnd w:id="22"/>
@@ -374,7 +374,7 @@
         <w:pStyle w:val="FirstParagraph"/>
       </w:pPr>
       <w:r>
-        <w:t xml:space="preserve">Of all forms of prejudice, the most destructive is racial prejudice. Bahá’ís strive actively to build bonds across every line of division.</w:t>
+        <w:t xml:space="preserve">Of all forms of prejudice, racial prejudice is the most destructive. Bahá’ís strive actively to build bonds across every line of division.</w:t>
       </w:r>
     </w:p>
     <w:bookmarkEnd w:id="24"/>
@@ -392,7 +392,7 @@
         <w:pStyle w:val="FirstParagraph"/>
       </w:pPr>
       <w:r>
-        <w:t xml:space="preserve">Religion without science is superstition; science without religion is materialism. Both are needed for human progress.</w:t>
+        <w:t xml:space="preserve">Religion without science is superstition; science without religion is materialism. Both are needed for the progress of civilisation.</w:t>
       </w:r>
     </w:p>
     <w:bookmarkEnd w:id="25"/>
@@ -410,7 +410,7 @@
         <w:pStyle w:val="FirstParagraph"/>
       </w:pPr>
       <w:r>
-        <w:t xml:space="preserve">Each person has the right and responsibility to search for truth independently, unfettered by superstition or tradition.</w:t>
+        <w:t xml:space="preserve">Each person has the right and responsibility to search for truth independently — unfettered by tradition, superstition, or the imitation of others.</w:t>
       </w:r>
     </w:p>
     <w:bookmarkEnd w:id="26"/>
@@ -428,7 +428,7 @@
         <w:pStyle w:val="FirstParagraph"/>
       </w:pPr>
       <w:r>
-        <w:t xml:space="preserve">Every child deserves access to education. Knowledge is a treasure and the means of progress for every community.</w:t>
+        <w:t xml:space="preserve">Regard every human being as a mine rich in gems. Education alone can reveal its treasures and enable all of humanity to benefit.</w:t>
       </w:r>
     </w:p>
     <w:p>
@@ -440,13 +440,13 @@
     </w:p>
     <w:bookmarkEnd w:id="27"/>
     <w:bookmarkEnd w:id="28"/>
-    <w:bookmarkStart w:id="29" w:name="our-community-the-baháís-of-winnipeg"/>
+    <w:bookmarkStart w:id="29" w:name="in-winnipeg-the-baháís-of-winnipeg"/>
     <w:p>
       <w:pPr>
         <w:pStyle w:val="Heading2"/>
       </w:pPr>
       <w:r>
-        <w:t xml:space="preserve">Our community — The Bahá’ís of Winnipeg</w:t>
+        <w:t xml:space="preserve">In Winnipeg — The Bahá’ís of Winnipeg</w:t>
       </w:r>
     </w:p>
     <w:p>
@@ -464,7 +464,7 @@
         <w:t xml:space="preserve"> </w:t>
       </w:r>
       <w:r>
-        <w:t xml:space="preserve">Our community</w:t>
+        <w:t xml:space="preserve">In Winnipeg</w:t>
       </w:r>
     </w:p>
     <w:p>
@@ -500,7 +500,7 @@
         <w:t xml:space="preserve"> </w:t>
       </w:r>
       <w:r>
-        <w:t xml:space="preserve">Like the two rivers that meet at the Forks, the Bahá’í Community of Winnipeg draws together people from many backgrounds, united by a shared vision of building a more just and peaceful world.</w:t>
+        <w:t xml:space="preserve">The two rivers converge at the Forks into a single united current — the vision of Bahá’u’lláh draws together people from every background into one community, working toward a more just and peaceful world.</w:t>
       </w:r>
     </w:p>
     <w:p>
@@ -508,7 +508,7 @@
         <w:pStyle w:val="BodyText"/>
       </w:pPr>
       <w:r>
-        <w:t xml:space="preserve">The Bahá’í community in Winnipeg has been present for over a century, growing from a handful of early believers into a vibrant community that reflects the city’s rich multicultural heritage. Today, members from dozens of cultural backgrounds come together in a spirit of unity.</w:t>
+        <w:t xml:space="preserve">The Bahá’í community in Winnipeg has been present for over a century, growing from a handful of early believers into a vibrant community that reflects the city’s rich multicultural heritage. Members from dozens of cultural backgrounds come together in a spirit of unity and shared purpose.</w:t>
       </w:r>
     </w:p>
     <w:p>
@@ -516,7 +516,7 @@
         <w:pStyle w:val="BodyText"/>
       </w:pPr>
       <w:r>
-        <w:t xml:space="preserve">Our community centre on McMillan Avenue serves as a gathering place for devotional programs, study circles, children’s classes, and community celebrations. We are deeply engaged in the life of our neighbourhoods, working alongside others to foster community building and social action.</w:t>
+        <w:t xml:space="preserve">Bahá’ís and their friends are deeply engaged in the life of Winnipeg’s neighbourhoods — through devotional meetings, study circles, children’s classes, and programs for junior youth. Working alongside neighbours and all those who share the desire to cultivate hope and foster purposeful effort in the world.</w:t>
       </w:r>
     </w:p>
     <w:p>
@@ -524,7 +524,7 @@
         <w:pStyle w:val="BodyText"/>
       </w:pPr>
       <w:r>
-        <w:t xml:space="preserve">Like the vast prairie sky that reminds us there is always room for growth, we believe that every person has a contribution to make. Whether you are exploring the Bahá’í Faith for the first time or looking for a welcoming community, we invite you to connect with us.</w:t>
+        <w:t xml:space="preserve">Every person has a contribution to make. Whether exploring the Bahá’í Faith for the first time or simply looking to participate in something meaningful, there is a place here.</w:t>
       </w:r>
     </w:p>
     <w:p>

</xml_diff>